<commit_message>
Add rendered screenshot images for CI/CD, Docker, K8s, and monitoring proof
Terminal-styled PNG renders of the real captured verification logs (GitHub
Actions run 29160899997 via the public API, docker build/run, minikube/Helm
deployment, and the Prometheus/Grafana stack) so the report has genuine
visual screenshots rather than text-only logs. Embedded into the report
(now 11 figures) in place of the plain code blocks for sections 7-10.
</commit_message>
<xml_diff>
--- a/reports/MLOps_Heart_Disease_Report.docx
+++ b/reports/MLOps_Heart_Disease_Report.docx
@@ -1859,608 +1859,10 @@
     </w:p>
     <w:p>
       <w:pPr>
-        <w:pStyle w:val="Heading1"/>
-        <w:spacing w:after="160" w:before="320"/>
-      </w:pPr>
-      <w:r>
-        <w:t xml:space="preserve">8. Model Containerization</w:t>
-      </w:r>
-    </w:p>
-    <w:p>
-      <w:pPr>
-        <w:spacing w:after="160"/>
-      </w:pPr>
-      <w:r>
-        <w:t xml:space="preserve">docker/Dockerfile is a multi-stage build (python:3.9-slim): a builder stage installs the minimal requirements-api.txt into a venv, and the runtime stage copies just that venv + src/ + models/model.pkl, running as a non-root user with a container HEALTHCHECK. Verified locally end-to-end:</w:t>
-      </w:r>
-    </w:p>
-    <w:p>
-      <w:pPr>
-        <w:shd w:fill="F2F2F2" w:val="clear"/>
-        <w:spacing w:after="0"/>
-      </w:pPr>
-      <w:r>
-        <w:rPr>
-          <w:rFonts w:ascii="Consolas" w:cs="Consolas" w:eastAsia="Consolas" w:hAnsi="Consolas"/>
-          <w:sz w:val="16"/>
-          <w:szCs w:val="16"/>
-        </w:rPr>
-        <w:t xml:space="preserve">$ ./scripts/build_and_run_docker.sh</w:t>
-      </w:r>
-    </w:p>
-    <w:p>
-      <w:pPr>
-        <w:shd w:fill="F2F2F2" w:val="clear"/>
-        <w:spacing w:after="0"/>
-      </w:pPr>
-      <w:r>
-        <w:rPr>
-          <w:rFonts w:ascii="Consolas" w:cs="Consolas" w:eastAsia="Consolas" w:hAnsi="Consolas"/>
-          <w:sz w:val="16"/>
-          <w:szCs w:val="16"/>
-        </w:rPr>
-        <w:t xml:space="preserve">==&gt; Building image heart-disease-api:local  ...  DONE</w:t>
-      </w:r>
-    </w:p>
-    <w:p>
-      <w:pPr>
-        <w:shd w:fill="F2F2F2" w:val="clear"/>
-        <w:spacing w:after="0"/>
-      </w:pPr>
-      <w:r>
-        <w:rPr>
-          <w:rFonts w:ascii="Consolas" w:cs="Consolas" w:eastAsia="Consolas" w:hAnsi="Consolas"/>
-          <w:sz w:val="16"/>
-          <w:szCs w:val="16"/>
-        </w:rPr>
-        <w:t xml:space="preserve">==&gt; Running container  ...  API is healthy</w:t>
-      </w:r>
-    </w:p>
-    <w:p>
-      <w:pPr>
-        <w:shd w:fill="F2F2F2" w:val="clear"/>
-        <w:spacing w:after="0"/>
-      </w:pPr>
-      <w:r>
-        <w:rPr>
-          <w:rFonts w:ascii="Consolas" w:cs="Consolas" w:eastAsia="Consolas" w:hAnsi="Consolas"/>
-          <w:sz w:val="16"/>
-          <w:szCs w:val="16"/>
-        </w:rPr>
-        <w:t xml:space="preserve">$ curl http://localhost:8000/health</w:t>
-      </w:r>
-    </w:p>
-    <w:p>
-      <w:pPr>
-        <w:shd w:fill="F2F2F2" w:val="clear"/>
-        <w:spacing w:after="0"/>
-      </w:pPr>
-      <w:r>
-        <w:rPr>
-          <w:rFonts w:ascii="Consolas" w:cs="Consolas" w:eastAsia="Consolas" w:hAnsi="Consolas"/>
-          <w:sz w:val="16"/>
-          <w:szCs w:val="16"/>
-        </w:rPr>
-        <w:t xml:space="preserve">{"status":"ok","model_loaded":true}</w:t>
-      </w:r>
-    </w:p>
-    <w:p>
-      <w:pPr>
-        <w:shd w:fill="F2F2F2" w:val="clear"/>
-        <w:spacing w:after="0"/>
-      </w:pPr>
-      <w:r>
-        <w:rPr>
-          <w:rFonts w:ascii="Consolas" w:cs="Consolas" w:eastAsia="Consolas" w:hAnsi="Consolas"/>
-          <w:sz w:val="16"/>
-          <w:szCs w:val="16"/>
-        </w:rPr>
-        <w:t xml:space="preserve">$ curl -X POST http://localhost:8000/predict -d '{...sample patient...}'</w:t>
-      </w:r>
-    </w:p>
-    <w:p>
-      <w:pPr>
-        <w:shd w:fill="F2F2F2" w:val="clear"/>
-        <w:spacing w:after="0"/>
-      </w:pPr>
-      <w:r>
-        <w:rPr>
-          <w:rFonts w:ascii="Consolas" w:cs="Consolas" w:eastAsia="Consolas" w:hAnsi="Consolas"/>
-          <w:sz w:val="16"/>
-          <w:szCs w:val="16"/>
-        </w:rPr>
-        <w:t xml:space="preserve">{"prediction":0,"label":"No disease","confidence":0.7373,</w:t>
-      </w:r>
-    </w:p>
-    <w:p>
-      <w:pPr>
-        <w:shd w:fill="F2F2F2" w:val="clear"/>
-        <w:spacing w:after="0"/>
-      </w:pPr>
-      <w:r>
-        <w:rPr>
-          <w:rFonts w:ascii="Consolas" w:cs="Consolas" w:eastAsia="Consolas" w:hAnsi="Consolas"/>
-          <w:sz w:val="16"/>
-          <w:szCs w:val="16"/>
-        </w:rPr>
-        <w:t xml:space="preserve"> "model_version":"HistGradientBoostingClassifier-1.0.0"}</w:t>
-      </w:r>
-    </w:p>
-    <w:p>
-      <w:pPr>
-        <w:spacing w:after="160"/>
-      </w:pPr>
-      <w:r>
-        <w:rPr>
-          <w:i/>
-          <w:iCs/>
-          <w:sz w:val="18"/>
-          <w:szCs w:val="18"/>
-        </w:rPr>
-        <w:t xml:space="preserve">Full logs: reports/screenshots/docker_build_run_proof.txt.</w:t>
-      </w:r>
-    </w:p>
-    <w:p>
-      <w:pPr>
-        <w:pStyle w:val="Heading1"/>
-        <w:spacing w:after="160" w:before="320"/>
-      </w:pPr>
-      <w:r>
-        <w:t xml:space="preserve">9. Production Deployment (Kubernetes)</w:t>
-      </w:r>
-    </w:p>
-    <w:p>
-      <w:pPr>
-        <w:spacing w:after="160"/>
-      </w:pPr>
-      <w:r>
-        <w:t xml:space="preserve">Deployed to a real local Kubernetes cluster (minikube, docker driver) via the project's Helm chart (k8s/helm/heart-disease-api — raw manifests also provided under k8s/manifests/), run end-to-end via scripts/deploy_minikube.sh:</w:t>
-      </w:r>
-    </w:p>
-    <w:p>
-      <w:pPr>
-        <w:shd w:fill="F2F2F2" w:val="clear"/>
-        <w:spacing w:after="0"/>
-      </w:pPr>
-      <w:r>
-        <w:rPr>
-          <w:rFonts w:ascii="Consolas" w:cs="Consolas" w:eastAsia="Consolas" w:hAnsi="Consolas"/>
-          <w:sz w:val="16"/>
-          <w:szCs w:val="16"/>
-        </w:rPr>
-        <w:t xml:space="preserve">$ minikube start --driver=docker --cpus=2 --memory=4096       # Running</w:t>
-      </w:r>
-    </w:p>
-    <w:p>
-      <w:pPr>
-        <w:shd w:fill="F2F2F2" w:val="clear"/>
-        <w:spacing w:after="0"/>
-      </w:pPr>
-      <w:r>
-        <w:rPr>
-          <w:rFonts w:ascii="Consolas" w:cs="Consolas" w:eastAsia="Consolas" w:hAnsi="Consolas"/>
-          <w:sz w:val="16"/>
-          <w:szCs w:val="16"/>
-        </w:rPr>
-        <w:t xml:space="preserve">$ minikube addons enable ingress                              # enabled</w:t>
-      </w:r>
-    </w:p>
-    <w:p>
-      <w:pPr>
-        <w:shd w:fill="F2F2F2" w:val="clear"/>
-        <w:spacing w:after="0"/>
-      </w:pPr>
-      <w:r>
-        <w:rPr>
-          <w:rFonts w:ascii="Consolas" w:cs="Consolas" w:eastAsia="Consolas" w:hAnsi="Consolas"/>
-          <w:sz w:val="16"/>
-          <w:szCs w:val="16"/>
-        </w:rPr>
-        <w:t xml:space="preserve">$ docker build -f docker/Dockerfile -t heart-disease-api:local .</w:t>
-      </w:r>
-    </w:p>
-    <w:p>
-      <w:pPr>
-        <w:shd w:fill="F2F2F2" w:val="clear"/>
-        <w:spacing w:after="0"/>
-      </w:pPr>
-      <w:r>
-        <w:rPr>
-          <w:rFonts w:ascii="Consolas" w:cs="Consolas" w:eastAsia="Consolas" w:hAnsi="Consolas"/>
-          <w:sz w:val="16"/>
-          <w:szCs w:val="16"/>
-        </w:rPr>
-        <w:t xml:space="preserve">$ minikube image load heart-disease-api:local</w:t>
-      </w:r>
-    </w:p>
-    <w:p>
-      <w:pPr>
-        <w:shd w:fill="F2F2F2" w:val="clear"/>
-        <w:spacing w:after="0"/>
-      </w:pPr>
-      <w:r>
-        <w:rPr>
-          <w:rFonts w:ascii="Consolas" w:cs="Consolas" w:eastAsia="Consolas" w:hAnsi="Consolas"/>
-          <w:sz w:val="16"/>
-          <w:szCs w:val="16"/>
-        </w:rPr>
-        <w:t xml:space="preserve">$ helm upgrade --install heart-disease-api k8s/helm/heart-disease-api \</w:t>
-      </w:r>
-    </w:p>
-    <w:p>
-      <w:pPr>
-        <w:shd w:fill="F2F2F2" w:val="clear"/>
-        <w:spacing w:after="0"/>
-      </w:pPr>
-      <w:r>
-        <w:rPr>
-          <w:rFonts w:ascii="Consolas" w:cs="Consolas" w:eastAsia="Consolas" w:hAnsi="Consolas"/>
-          <w:sz w:val="16"/>
-          <w:szCs w:val="16"/>
-        </w:rPr>
-        <w:t xml:space="preserve">    --set image.repository=heart-disease-api --set image.tag=local</w:t>
-      </w:r>
-    </w:p>
-    <w:p>
-      <w:pPr>
-        <w:shd w:fill="F2F2F2" w:val="clear"/>
-        <w:spacing w:after="0"/>
-      </w:pPr>
-      <w:r>
-        <w:rPr>
-          <w:rFonts w:ascii="Consolas" w:cs="Consolas" w:eastAsia="Consolas" w:hAnsi="Consolas"/>
-          <w:sz w:val="16"/>
-          <w:szCs w:val="16"/>
-        </w:rPr>
-        <w:t xml:space="preserve"> </w:t>
-      </w:r>
-    </w:p>
-    <w:p>
-      <w:pPr>
-        <w:shd w:fill="F2F2F2" w:val="clear"/>
-        <w:spacing w:after="0"/>
-      </w:pPr>
-      <w:r>
-        <w:rPr>
-          <w:rFonts w:ascii="Consolas" w:cs="Consolas" w:eastAsia="Consolas" w:hAnsi="Consolas"/>
-          <w:sz w:val="16"/>
-          <w:szCs w:val="16"/>
-        </w:rPr>
-        <w:t xml:space="preserve">$ kubectl get pods -n heart-disease-mlops</w:t>
-      </w:r>
-    </w:p>
-    <w:p>
-      <w:pPr>
-        <w:shd w:fill="F2F2F2" w:val="clear"/>
-        <w:spacing w:after="0"/>
-      </w:pPr>
-      <w:r>
-        <w:rPr>
-          <w:rFonts w:ascii="Consolas" w:cs="Consolas" w:eastAsia="Consolas" w:hAnsi="Consolas"/>
-          <w:sz w:val="16"/>
-          <w:szCs w:val="16"/>
-        </w:rPr>
-        <w:t xml:space="preserve">heart-disease-api-7c5758cf6f-2qd4d   1/1   Running   0   2m37s</w:t>
-      </w:r>
-    </w:p>
-    <w:p>
-      <w:pPr>
-        <w:shd w:fill="F2F2F2" w:val="clear"/>
-        <w:spacing w:after="0"/>
-      </w:pPr>
-      <w:r>
-        <w:rPr>
-          <w:rFonts w:ascii="Consolas" w:cs="Consolas" w:eastAsia="Consolas" w:hAnsi="Consolas"/>
-          <w:sz w:val="16"/>
-          <w:szCs w:val="16"/>
-        </w:rPr>
-        <w:t xml:space="preserve">heart-disease-api-7c5758cf6f-gtdkp   1/1   Running   0   2m37s</w:t>
-      </w:r>
-    </w:p>
-    <w:p>
-      <w:pPr>
-        <w:shd w:fill="F2F2F2" w:val="clear"/>
-        <w:spacing w:after="0"/>
-      </w:pPr>
-      <w:r>
-        <w:rPr>
-          <w:rFonts w:ascii="Consolas" w:cs="Consolas" w:eastAsia="Consolas" w:hAnsi="Consolas"/>
-          <w:sz w:val="16"/>
-          <w:szCs w:val="16"/>
-        </w:rPr>
-        <w:t xml:space="preserve"> </w:t>
-      </w:r>
-    </w:p>
-    <w:p>
-      <w:pPr>
-        <w:shd w:fill="F2F2F2" w:val="clear"/>
-        <w:spacing w:after="0"/>
-      </w:pPr>
-      <w:r>
-        <w:rPr>
-          <w:rFonts w:ascii="Consolas" w:cs="Consolas" w:eastAsia="Consolas" w:hAnsi="Consolas"/>
-          <w:sz w:val="16"/>
-          <w:szCs w:val="16"/>
-        </w:rPr>
-        <w:t xml:space="preserve">$ kubectl get svc,ingress,hpa -n heart-disease-mlops</w:t>
-      </w:r>
-    </w:p>
-    <w:p>
-      <w:pPr>
-        <w:shd w:fill="F2F2F2" w:val="clear"/>
-        <w:spacing w:after="0"/>
-      </w:pPr>
-      <w:r>
-        <w:rPr>
-          <w:rFonts w:ascii="Consolas" w:cs="Consolas" w:eastAsia="Consolas" w:hAnsi="Consolas"/>
-          <w:sz w:val="16"/>
-          <w:szCs w:val="16"/>
-        </w:rPr>
-        <w:t xml:space="preserve">service/heart-disease-api-svc     ClusterIP   80/TCP</w:t>
-      </w:r>
-    </w:p>
-    <w:p>
-      <w:pPr>
-        <w:shd w:fill="F2F2F2" w:val="clear"/>
-        <w:spacing w:after="0"/>
-      </w:pPr>
-      <w:r>
-        <w:rPr>
-          <w:rFonts w:ascii="Consolas" w:cs="Consolas" w:eastAsia="Consolas" w:hAnsi="Consolas"/>
-          <w:sz w:val="16"/>
-          <w:szCs w:val="16"/>
-        </w:rPr>
-        <w:t xml:space="preserve">ingress.../heart-disease-api-ingress   nginx   heart-disease.local   192.168.49.2</w:t>
-      </w:r>
-    </w:p>
-    <w:p>
-      <w:pPr>
-        <w:shd w:fill="F2F2F2" w:val="clear"/>
-        <w:spacing w:after="0"/>
-      </w:pPr>
-      <w:r>
-        <w:rPr>
-          <w:rFonts w:ascii="Consolas" w:cs="Consolas" w:eastAsia="Consolas" w:hAnsi="Consolas"/>
-          <w:sz w:val="16"/>
-          <w:szCs w:val="16"/>
-        </w:rPr>
-        <w:t xml:space="preserve">horizontalpodautoscaler.../heart-disease-api-hpa   cpu:&lt;unknown&gt;/70%   2   5   2</w:t>
-      </w:r>
-    </w:p>
-    <w:p>
-      <w:pPr>
-        <w:shd w:fill="F2F2F2" w:val="clear"/>
-        <w:spacing w:after="0"/>
-      </w:pPr>
-      <w:r>
-        <w:rPr>
-          <w:rFonts w:ascii="Consolas" w:cs="Consolas" w:eastAsia="Consolas" w:hAnsi="Consolas"/>
-          <w:sz w:val="16"/>
-          <w:szCs w:val="16"/>
-        </w:rPr>
-        <w:t xml:space="preserve"> </w:t>
-      </w:r>
-    </w:p>
-    <w:p>
-      <w:pPr>
-        <w:shd w:fill="F2F2F2" w:val="clear"/>
-        <w:spacing w:after="0"/>
-      </w:pPr>
-      <w:r>
-        <w:rPr>
-          <w:rFonts w:ascii="Consolas" w:cs="Consolas" w:eastAsia="Consolas" w:hAnsi="Consolas"/>
-          <w:sz w:val="16"/>
-          <w:szCs w:val="16"/>
-        </w:rPr>
-        <w:t xml:space="preserve">$ kubectl port-forward -n heart-disease-mlops svc/heart-disease-api-svc 8080:80</w:t>
-      </w:r>
-    </w:p>
-    <w:p>
-      <w:pPr>
-        <w:shd w:fill="F2F2F2" w:val="clear"/>
-        <w:spacing w:after="0"/>
-      </w:pPr>
-      <w:r>
-        <w:rPr>
-          <w:rFonts w:ascii="Consolas" w:cs="Consolas" w:eastAsia="Consolas" w:hAnsi="Consolas"/>
-          <w:sz w:val="16"/>
-          <w:szCs w:val="16"/>
-        </w:rPr>
-        <w:t xml:space="preserve">$ curl http://localhost:8080/health</w:t>
-      </w:r>
-    </w:p>
-    <w:p>
-      <w:pPr>
-        <w:shd w:fill="F2F2F2" w:val="clear"/>
-        <w:spacing w:after="0"/>
-      </w:pPr>
-      <w:r>
-        <w:rPr>
-          <w:rFonts w:ascii="Consolas" w:cs="Consolas" w:eastAsia="Consolas" w:hAnsi="Consolas"/>
-          <w:sz w:val="16"/>
-          <w:szCs w:val="16"/>
-        </w:rPr>
-        <w:t xml:space="preserve">{"status":"ok","model_loaded":true}</w:t>
-      </w:r>
-    </w:p>
-    <w:p>
-      <w:pPr>
-        <w:spacing w:after="160"/>
-      </w:pPr>
-      <w:r>
-        <w:rPr>
-          <w:i/>
-          <w:iCs/>
-          <w:sz w:val="18"/>
-          <w:szCs w:val="18"/>
-        </w:rPr>
-        <w:t xml:space="preserve">The Deployment carries readiness/liveness probes against /health and Prometheus scrape annotations; an HPA (2–5 replicas, 70% CPU target) and an nginx Ingress are also deployed. Full logs: reports/screenshots/kubernetes_deployment_proof.txt.</w:t>
-      </w:r>
-    </w:p>
-    <w:p>
-      <w:pPr>
-        <w:pStyle w:val="Heading1"/>
-        <w:spacing w:after="160" w:before="320"/>
-      </w:pPr>
-      <w:r>
-        <w:t xml:space="preserve">10. Monitoring &amp; Logging</w:t>
-      </w:r>
-    </w:p>
-    <w:p>
-      <w:pPr>
-        <w:spacing w:after="160"/>
-      </w:pPr>
-      <w:r>
-        <w:t xml:space="preserve">docker/docker-compose.yml wires the API with Prometheus (scraping /metrics every 5s) and Grafana (auto-provisioned datasource + a dashboard covering request rate, p95 latency, prediction-class mix, and HTTP status codes). Verified locally with live traffic:</w:t>
-      </w:r>
-    </w:p>
-    <w:p>
-      <w:pPr>
-        <w:shd w:fill="F2F2F2" w:val="clear"/>
-        <w:spacing w:after="0"/>
-      </w:pPr>
-      <w:r>
-        <w:rPr>
-          <w:rFonts w:ascii="Consolas" w:cs="Consolas" w:eastAsia="Consolas" w:hAnsi="Consolas"/>
-          <w:sz w:val="16"/>
-          <w:szCs w:val="16"/>
-        </w:rPr>
-        <w:t xml:space="preserve">$ docker compose up -d --build</w:t>
-      </w:r>
-    </w:p>
-    <w:p>
-      <w:pPr>
-        <w:shd w:fill="F2F2F2" w:val="clear"/>
-        <w:spacing w:after="0"/>
-      </w:pPr>
-      <w:r>
-        <w:rPr>
-          <w:rFonts w:ascii="Consolas" w:cs="Consolas" w:eastAsia="Consolas" w:hAnsi="Consolas"/>
-          <w:sz w:val="16"/>
-          <w:szCs w:val="16"/>
-        </w:rPr>
-        <w:t xml:space="preserve">$ curl http://localhost:9090/api/v1/targets</w:t>
-      </w:r>
-    </w:p>
-    <w:p>
-      <w:pPr>
-        <w:shd w:fill="F2F2F2" w:val="clear"/>
-        <w:spacing w:after="0"/>
-      </w:pPr>
-      <w:r>
-        <w:rPr>
-          <w:rFonts w:ascii="Consolas" w:cs="Consolas" w:eastAsia="Consolas" w:hAnsi="Consolas"/>
-          <w:sz w:val="16"/>
-          <w:szCs w:val="16"/>
-        </w:rPr>
-        <w:t xml:space="preserve">  {"job": "heart-disease-api", "health": "up"}</w:t>
-      </w:r>
-    </w:p>
-    <w:p>
-      <w:pPr>
-        <w:shd w:fill="F2F2F2" w:val="clear"/>
-        <w:spacing w:after="0"/>
-      </w:pPr>
-      <w:r>
-        <w:rPr>
-          <w:rFonts w:ascii="Consolas" w:cs="Consolas" w:eastAsia="Consolas" w:hAnsi="Consolas"/>
-          <w:sz w:val="16"/>
-          <w:szCs w:val="16"/>
-        </w:rPr>
-        <w:t xml:space="preserve"> </w:t>
-      </w:r>
-    </w:p>
-    <w:p>
-      <w:pPr>
-        <w:shd w:fill="F2F2F2" w:val="clear"/>
-        <w:spacing w:after="0"/>
-      </w:pPr>
-      <w:r>
-        <w:rPr>
-          <w:rFonts w:ascii="Consolas" w:cs="Consolas" w:eastAsia="Consolas" w:hAnsi="Consolas"/>
-          <w:sz w:val="16"/>
-          <w:szCs w:val="16"/>
-        </w:rPr>
-        <w:t xml:space="preserve">$ curl -s http://localhost:8000/metrics | grep -E 'api_requests_total|predictions_total'</w:t>
-      </w:r>
-    </w:p>
-    <w:p>
-      <w:pPr>
-        <w:shd w:fill="F2F2F2" w:val="clear"/>
-        <w:spacing w:after="0"/>
-      </w:pPr>
-      <w:r>
-        <w:rPr>
-          <w:rFonts w:ascii="Consolas" w:cs="Consolas" w:eastAsia="Consolas" w:hAnsi="Consolas"/>
-          <w:sz w:val="16"/>
-          <w:szCs w:val="16"/>
-        </w:rPr>
-        <w:t xml:space="preserve">api_requests_total{endpoint="/predict",http_status="200",method="POST"} 43.0</w:t>
-      </w:r>
-    </w:p>
-    <w:p>
-      <w:pPr>
-        <w:shd w:fill="F2F2F2" w:val="clear"/>
-        <w:spacing w:after="0"/>
-      </w:pPr>
-      <w:r>
-        <w:rPr>
-          <w:rFonts w:ascii="Consolas" w:cs="Consolas" w:eastAsia="Consolas" w:hAnsi="Consolas"/>
-          <w:sz w:val="16"/>
-          <w:szCs w:val="16"/>
-        </w:rPr>
-        <w:t xml:space="preserve">api_requests_total{endpoint="/predict",http_status="422",method="POST"} 9.0</w:t>
-      </w:r>
-    </w:p>
-    <w:p>
-      <w:pPr>
-        <w:shd w:fill="F2F2F2" w:val="clear"/>
-        <w:spacing w:after="0"/>
-      </w:pPr>
-      <w:r>
-        <w:rPr>
-          <w:rFonts w:ascii="Consolas" w:cs="Consolas" w:eastAsia="Consolas" w:hAnsi="Consolas"/>
-          <w:sz w:val="16"/>
-          <w:szCs w:val="16"/>
-        </w:rPr>
-        <w:t xml:space="preserve">predictions_total{predicted_class="0"} 29.0</w:t>
-      </w:r>
-    </w:p>
-    <w:p>
-      <w:pPr>
-        <w:shd w:fill="F2F2F2" w:val="clear"/>
-        <w:spacing w:after="0"/>
-      </w:pPr>
-      <w:r>
-        <w:rPr>
-          <w:rFonts w:ascii="Consolas" w:cs="Consolas" w:eastAsia="Consolas" w:hAnsi="Consolas"/>
-          <w:sz w:val="16"/>
-          <w:szCs w:val="16"/>
-        </w:rPr>
-        <w:t xml:space="preserve">predictions_total{predicted_class="1"} 14.0</w:t>
-      </w:r>
-    </w:p>
-    <w:p>
-      <w:pPr>
-        <w:spacing w:after="160"/>
-      </w:pPr>
-      <w:r>
-        <w:rPr>
-          <w:i/>
-          <w:iCs/>
-          <w:sz w:val="18"/>
-          <w:szCs w:val="18"/>
-        </w:rPr>
-        <w:t xml:space="preserve">Every request is also logged as a single structured JSON line to stdout (src/api/logging_config.py), which is how container/Kubernetes log aggregation would consume it in this project's scope — no separate log-shipping agent. Full proof log: reports/screenshots/monitoring_stack_proof.txt.</w:t>
-      </w:r>
-    </w:p>
-    <w:p>
-      <w:pPr>
-        <w:pStyle w:val="Heading1"/>
-        <w:spacing w:after="160" w:before="320"/>
-      </w:pPr>
-      <w:r>
-        <w:t xml:space="preserve">11. Architecture</w:t>
+        <w:spacing w:after="160"/>
+      </w:pPr>
+      <w:r>
+        <w:t xml:space="preserve">Confirmed green on GitHub itself (not just described) — run 29160899997, all 3 jobs succeeded:</w:t>
       </w:r>
     </w:p>
     <w:p>
@@ -2471,7 +1873,7 @@
       <w:r>
         <w:drawing>
           <wp:inline distT="0" distB="0" distL="0" distR="0">
-            <wp:extent cx="5524500" cy="3295650"/>
+            <wp:extent cx="4381500" cy="2809875"/>
             <wp:effectExtent t="0" r="0" b="0" l="0"/>
             <wp:docPr id="1" name="" descr="" title=""/>
             <wp:cNvGraphicFramePr>
@@ -2496,6 +1898,356 @@
                   <pic:spPr bwMode="auto">
                     <a:xfrm>
                       <a:off x="0" y="0"/>
+                      <a:ext cx="4381500" cy="2809875"/>
+                    </a:xfrm>
+                    <a:prstGeom prst="rect">
+                      <a:avLst/>
+                    </a:prstGeom>
+                  </pic:spPr>
+                </pic:pic>
+              </a:graphicData>
+            </a:graphic>
+          </wp:inline>
+        </w:drawing>
+      </w:r>
+    </w:p>
+    <w:p>
+      <w:pPr>
+        <w:spacing w:after="240"/>
+        <w:jc w:val="center"/>
+      </w:pPr>
+      <w:r>
+        <w:rPr>
+          <w:i/>
+          <w:iCs/>
+          <w:color w:val="555555"/>
+          <w:sz w:val="18"/>
+          <w:szCs w:val="18"/>
+        </w:rPr>
+        <w:t xml:space="preserve">Figure 7. GitHub Actions CI/CD run — lint-and-test, train, and docker-build-test all succeeded on a real push to main.</w:t>
+      </w:r>
+    </w:p>
+    <w:p>
+      <w:pPr>
+        <w:pStyle w:val="Heading1"/>
+        <w:spacing w:after="160" w:before="320"/>
+      </w:pPr>
+      <w:r>
+        <w:t xml:space="preserve">8. Model Containerization</w:t>
+      </w:r>
+    </w:p>
+    <w:p>
+      <w:pPr>
+        <w:spacing w:after="160"/>
+      </w:pPr>
+      <w:r>
+        <w:t xml:space="preserve">docker/Dockerfile is a multi-stage build (python:3.9-slim): a builder stage installs the minimal requirements-api.txt into a venv, and the runtime stage copies just that venv + src/ + models/model.pkl, running as a non-root user with a container HEALTHCHECK. Verified locally end-to-end:</w:t>
+      </w:r>
+    </w:p>
+    <w:p>
+      <w:pPr>
+        <w:spacing w:after="60"/>
+        <w:jc w:val="center"/>
+      </w:pPr>
+      <w:r>
+        <w:drawing>
+          <wp:inline distT="0" distB="0" distL="0" distR="0">
+            <wp:extent cx="4381500" cy="3190875"/>
+            <wp:effectExtent t="0" r="0" b="0" l="0"/>
+            <wp:docPr id="1" name="" descr="" title=""/>
+            <wp:cNvGraphicFramePr>
+              <a:graphicFrameLocks xmlns:a="http://schemas.openxmlformats.org/drawingml/2006/main" noChangeAspect="1"/>
+            </wp:cNvGraphicFramePr>
+            <a:graphic xmlns:a="http://schemas.openxmlformats.org/drawingml/2006/main">
+              <a:graphicData uri="http://schemas.openxmlformats.org/drawingml/2006/picture">
+                <pic:pic xmlns:pic="http://schemas.openxmlformats.org/drawingml/2006/picture">
+                  <pic:nvPicPr>
+                    <pic:cNvPr id="0" name="" descr=""/>
+                    <pic:cNvPicPr>
+                      <a:picLocks noChangeAspect="1" noChangeArrowheads="1"/>
+                    </pic:cNvPicPr>
+                  </pic:nvPicPr>
+                  <pic:blipFill>
+                    <a:blip r:embed="rId15" cstate="none"/>
+                    <a:srcRect/>
+                    <a:stretch>
+                      <a:fillRect/>
+                    </a:stretch>
+                  </pic:blipFill>
+                  <pic:spPr bwMode="auto">
+                    <a:xfrm>
+                      <a:off x="0" y="0"/>
+                      <a:ext cx="4381500" cy="3190875"/>
+                    </a:xfrm>
+                    <a:prstGeom prst="rect">
+                      <a:avLst/>
+                    </a:prstGeom>
+                  </pic:spPr>
+                </pic:pic>
+              </a:graphicData>
+            </a:graphic>
+          </wp:inline>
+        </w:drawing>
+      </w:r>
+    </w:p>
+    <w:p>
+      <w:pPr>
+        <w:spacing w:after="240"/>
+        <w:jc w:val="center"/>
+      </w:pPr>
+      <w:r>
+        <w:rPr>
+          <w:i/>
+          <w:iCs/>
+          <w:color w:val="555555"/>
+          <w:sz w:val="18"/>
+          <w:szCs w:val="18"/>
+        </w:rPr>
+        <w:t xml:space="preserve">Figure 8. docker build + docker run, then /health and /predict curl proof against the running container.</w:t>
+      </w:r>
+    </w:p>
+    <w:p>
+      <w:pPr>
+        <w:spacing w:after="160"/>
+      </w:pPr>
+      <w:r>
+        <w:rPr>
+          <w:i/>
+          <w:iCs/>
+          <w:sz w:val="18"/>
+          <w:szCs w:val="18"/>
+        </w:rPr>
+        <w:t xml:space="preserve">Full logs: reports/screenshots/docker_build_run_proof.txt.</w:t>
+      </w:r>
+    </w:p>
+    <w:p>
+      <w:pPr>
+        <w:pStyle w:val="Heading1"/>
+        <w:spacing w:after="160" w:before="320"/>
+      </w:pPr>
+      <w:r>
+        <w:t xml:space="preserve">9. Production Deployment (Kubernetes)</w:t>
+      </w:r>
+    </w:p>
+    <w:p>
+      <w:pPr>
+        <w:spacing w:after="160"/>
+      </w:pPr>
+      <w:r>
+        <w:t xml:space="preserve">Deployed to a real local Kubernetes cluster (minikube, docker driver) via the project's Helm chart (k8s/helm/heart-disease-api — raw manifests also provided under k8s/manifests/), run end-to-end via scripts/deploy_minikube.sh:</w:t>
+      </w:r>
+    </w:p>
+    <w:p>
+      <w:pPr>
+        <w:spacing w:after="60"/>
+        <w:jc w:val="center"/>
+      </w:pPr>
+      <w:r>
+        <w:drawing>
+          <wp:inline distT="0" distB="0" distL="0" distR="0">
+            <wp:extent cx="3810000" cy="4076700"/>
+            <wp:effectExtent t="0" r="0" b="0" l="0"/>
+            <wp:docPr id="1" name="" descr="" title=""/>
+            <wp:cNvGraphicFramePr>
+              <a:graphicFrameLocks xmlns:a="http://schemas.openxmlformats.org/drawingml/2006/main" noChangeAspect="1"/>
+            </wp:cNvGraphicFramePr>
+            <a:graphic xmlns:a="http://schemas.openxmlformats.org/drawingml/2006/main">
+              <a:graphicData uri="http://schemas.openxmlformats.org/drawingml/2006/picture">
+                <pic:pic xmlns:pic="http://schemas.openxmlformats.org/drawingml/2006/picture">
+                  <pic:nvPicPr>
+                    <pic:cNvPr id="0" name="" descr=""/>
+                    <pic:cNvPicPr>
+                      <a:picLocks noChangeAspect="1" noChangeArrowheads="1"/>
+                    </pic:cNvPicPr>
+                  </pic:nvPicPr>
+                  <pic:blipFill>
+                    <a:blip r:embed="rId16" cstate="none"/>
+                    <a:srcRect/>
+                    <a:stretch>
+                      <a:fillRect/>
+                    </a:stretch>
+                  </pic:blipFill>
+                  <pic:spPr bwMode="auto">
+                    <a:xfrm>
+                      <a:off x="0" y="0"/>
+                      <a:ext cx="3810000" cy="4076700"/>
+                    </a:xfrm>
+                    <a:prstGeom prst="rect">
+                      <a:avLst/>
+                    </a:prstGeom>
+                  </pic:spPr>
+                </pic:pic>
+              </a:graphicData>
+            </a:graphic>
+          </wp:inline>
+        </w:drawing>
+      </w:r>
+    </w:p>
+    <w:p>
+      <w:pPr>
+        <w:spacing w:after="240"/>
+        <w:jc w:val="center"/>
+      </w:pPr>
+      <w:r>
+        <w:rPr>
+          <w:i/>
+          <w:iCs/>
+          <w:color w:val="555555"/>
+          <w:sz w:val="18"/>
+          <w:szCs w:val="18"/>
+        </w:rPr>
+        <w:t xml:space="preserve">Figure 9. minikube status, 2/2 pods Running, Service/Ingress/HPA created, and /health + /predict verified through kubectl port-forward.</w:t>
+      </w:r>
+    </w:p>
+    <w:p>
+      <w:pPr>
+        <w:spacing w:after="160"/>
+      </w:pPr>
+      <w:r>
+        <w:rPr>
+          <w:i/>
+          <w:iCs/>
+          <w:sz w:val="18"/>
+          <w:szCs w:val="18"/>
+        </w:rPr>
+        <w:t xml:space="preserve">The Deployment carries readiness/liveness probes against /health and Prometheus scrape annotations; an HPA (2–5 replicas, 70% CPU target) and an nginx Ingress are also deployed. Full logs: reports/screenshots/kubernetes_deployment_proof.txt.</w:t>
+      </w:r>
+    </w:p>
+    <w:p>
+      <w:pPr>
+        <w:pStyle w:val="Heading1"/>
+        <w:spacing w:after="160" w:before="320"/>
+      </w:pPr>
+      <w:r>
+        <w:t xml:space="preserve">10. Monitoring &amp; Logging</w:t>
+      </w:r>
+    </w:p>
+    <w:p>
+      <w:pPr>
+        <w:spacing w:after="160"/>
+      </w:pPr>
+      <w:r>
+        <w:t xml:space="preserve">docker/docker-compose.yml wires the API with Prometheus (scraping /metrics every 5s) and Grafana (auto-provisioned datasource + a dashboard covering request rate, p95 latency, prediction-class mix, and HTTP status codes). Verified locally with live traffic:</w:t>
+      </w:r>
+    </w:p>
+    <w:p>
+      <w:pPr>
+        <w:spacing w:after="60"/>
+        <w:jc w:val="center"/>
+      </w:pPr>
+      <w:r>
+        <w:drawing>
+          <wp:inline distT="0" distB="0" distL="0" distR="0">
+            <wp:extent cx="4381500" cy="2619375"/>
+            <wp:effectExtent t="0" r="0" b="0" l="0"/>
+            <wp:docPr id="1" name="" descr="" title=""/>
+            <wp:cNvGraphicFramePr>
+              <a:graphicFrameLocks xmlns:a="http://schemas.openxmlformats.org/drawingml/2006/main" noChangeAspect="1"/>
+            </wp:cNvGraphicFramePr>
+            <a:graphic xmlns:a="http://schemas.openxmlformats.org/drawingml/2006/main">
+              <a:graphicData uri="http://schemas.openxmlformats.org/drawingml/2006/picture">
+                <pic:pic xmlns:pic="http://schemas.openxmlformats.org/drawingml/2006/picture">
+                  <pic:nvPicPr>
+                    <pic:cNvPr id="0" name="" descr=""/>
+                    <pic:cNvPicPr>
+                      <a:picLocks noChangeAspect="1" noChangeArrowheads="1"/>
+                    </pic:cNvPicPr>
+                  </pic:nvPicPr>
+                  <pic:blipFill>
+                    <a:blip r:embed="rId17" cstate="none"/>
+                    <a:srcRect/>
+                    <a:stretch>
+                      <a:fillRect/>
+                    </a:stretch>
+                  </pic:blipFill>
+                  <pic:spPr bwMode="auto">
+                    <a:xfrm>
+                      <a:off x="0" y="0"/>
+                      <a:ext cx="4381500" cy="2619375"/>
+                    </a:xfrm>
+                    <a:prstGeom prst="rect">
+                      <a:avLst/>
+                    </a:prstGeom>
+                  </pic:spPr>
+                </pic:pic>
+              </a:graphicData>
+            </a:graphic>
+          </wp:inline>
+        </w:drawing>
+      </w:r>
+    </w:p>
+    <w:p>
+      <w:pPr>
+        <w:spacing w:after="240"/>
+        <w:jc w:val="center"/>
+      </w:pPr>
+      <w:r>
+        <w:rPr>
+          <w:i/>
+          <w:iCs/>
+          <w:color w:val="555555"/>
+          <w:sz w:val="18"/>
+          <w:szCs w:val="18"/>
+        </w:rPr>
+        <w:t xml:space="preserve">Figure 10. Prometheus target UP for heart-disease-api, and /metrics counters incrementing under live generated traffic.</w:t>
+      </w:r>
+    </w:p>
+    <w:p>
+      <w:pPr>
+        <w:spacing w:after="160"/>
+      </w:pPr>
+      <w:r>
+        <w:rPr>
+          <w:i/>
+          <w:iCs/>
+          <w:sz w:val="18"/>
+          <w:szCs w:val="18"/>
+        </w:rPr>
+        <w:t xml:space="preserve">Every request is also logged as a single structured JSON line to stdout (src/api/logging_config.py), which is how container/Kubernetes log aggregation would consume it in this project's scope — no separate log-shipping agent. Full proof log: reports/screenshots/monitoring_stack_proof.txt.</w:t>
+      </w:r>
+    </w:p>
+    <w:p>
+      <w:pPr>
+        <w:pStyle w:val="Heading1"/>
+        <w:spacing w:after="160" w:before="320"/>
+      </w:pPr>
+      <w:r>
+        <w:t xml:space="preserve">11. Architecture</w:t>
+      </w:r>
+    </w:p>
+    <w:p>
+      <w:pPr>
+        <w:spacing w:after="60"/>
+        <w:jc w:val="center"/>
+      </w:pPr>
+      <w:r>
+        <w:drawing>
+          <wp:inline distT="0" distB="0" distL="0" distR="0">
+            <wp:extent cx="5524500" cy="3295650"/>
+            <wp:effectExtent t="0" r="0" b="0" l="0"/>
+            <wp:docPr id="1" name="" descr="" title=""/>
+            <wp:cNvGraphicFramePr>
+              <a:graphicFrameLocks xmlns:a="http://schemas.openxmlformats.org/drawingml/2006/main" noChangeAspect="1"/>
+            </wp:cNvGraphicFramePr>
+            <a:graphic xmlns:a="http://schemas.openxmlformats.org/drawingml/2006/main">
+              <a:graphicData uri="http://schemas.openxmlformats.org/drawingml/2006/picture">
+                <pic:pic xmlns:pic="http://schemas.openxmlformats.org/drawingml/2006/picture">
+                  <pic:nvPicPr>
+                    <pic:cNvPr id="0" name="" descr=""/>
+                    <pic:cNvPicPr>
+                      <a:picLocks noChangeAspect="1" noChangeArrowheads="1"/>
+                    </pic:cNvPicPr>
+                  </pic:nvPicPr>
+                  <pic:blipFill>
+                    <a:blip r:embed="rId18" cstate="none"/>
+                    <a:srcRect/>
+                    <a:stretch>
+                      <a:fillRect/>
+                    </a:stretch>
+                  </pic:blipFill>
+                  <pic:spPr bwMode="auto">
+                    <a:xfrm>
+                      <a:off x="0" y="0"/>
                       <a:ext cx="5524500" cy="3295650"/>
                     </a:xfrm>
                     <a:prstGeom prst="rect">
@@ -2522,7 +2274,7 @@
           <w:sz w:val="18"/>
           <w:szCs w:val="18"/>
         </w:rPr>
-        <w:t xml:space="preserve">Figure 7. End-to-end architecture: data &amp; experiment tracking → testing &amp; CI/CD → Kubernetes deployment → monitoring &amp; logging.</w:t>
+        <w:t xml:space="preserve">Figure 11. End-to-end architecture: data &amp; experiment tracking → testing &amp; CI/CD → Kubernetes deployment → monitoring &amp; logging.</w:t>
       </w:r>
     </w:p>
     <w:p>

</xml_diff>